<commit_message>
Complete final lifecycle and benchmark evidence
</commit_message>
<xml_diff>
--- a/提交材料/04_参考文献与数据依据.docx
+++ b/提交材料/04_参考文献与数据依据.docx
@@ -259,20 +259,20 @@
         <w:keepNext/>
       </w:pPr>
       <w:r>
-        <w:t xml:space="preserve">二、技术研究依据</w:t>
-      </w:r>
-    </w:p>
-    <w:p>
-      <w:r>
-        <w:t xml:space="preserve"/>
-      </w:r>
-    </w:p>
-    <w:p>
-      <w:pPr>
-        <w:pStyle w:val="BodyText"/>
-      </w:pPr>
-      <w:r>
-        <w:t xml:space="preserve">Wehner等针对电动车制造根因分析提出知识图谱、因果贝叶斯网络和专家反馈结合的方法，说明专家知识能缩小因果搜索空间并减少伪因果。Root-KGD将工业数据特征与设备、物流等实体结合，用知识图谱定位根因并提供物理实体解释。Fraunhofer研究进一步将异常检测、时间有效因果图和反事实干预组合，使候选根因具有可验证、可证伪路径。制造问题求解GraphRAG研究把在线异常检测、FMEA贝叶斯网络、历史8D图谱和混合检索串联，为本方案的“发现—推理—行动”提供技术依据。Document GraphRAG和ProQ-KG分别支撑制造文档结构检索及产品—过程—资源—FMEA统一建模。</w:t>
+        <w:t xml:space="preserve">二、公开数据验证边界</w:t>
+      </w:r>
+    </w:p>
+    <w:p>
+      <w:r>
+        <w:t xml:space="preserve"/>
+      </w:r>
+    </w:p>
+    <w:p>
+      <w:pPr>
+        <w:pStyle w:val="BodyText"/>
+      </w:pPr>
+      <w:r>
+        <w:t xml:space="preserve">为避免把工程仿真误写成现场收益，本作品另设公开数据验证层。UCI Machine Learning Repository 的 SECOM 数据集来自半导体制造过程，包含1567条样本、591个匿名特征、时间戳、合格/不合格标签和缺失值。它适合验证缺失值治理、异常筛选、风险排序、数据契约和任务编排的通用机制；匿名特征不映射为赛力斯的扭矩、焊接电流或模温，也不用于证明赛力斯真实设备根因、维修措施、VIN影响范围、复机授权或现场收益。仓库保存`data/public_benchmark_profile.json`作为来源、字段映射和复现要求卡片，不提交原始数据，不虚构尚未运行的分类指标。</w:t>
       </w:r>
     </w:p>
     <w:p>
@@ -286,46 +286,20 @@
         <w:keepNext/>
       </w:pPr>
       <w:r>
-        <w:t xml:space="preserve">三、质量管理与可信AI依据</w:t>
-      </w:r>
-    </w:p>
-    <w:p>
-      <w:r>
-        <w:t xml:space="preserve"/>
-      </w:r>
-    </w:p>
-    <w:p>
-      <w:pPr>
-        <w:pStyle w:val="BodyText"/>
-      </w:pPr>
-      <w:r>
-        <w:t xml:space="preserve">ISO 9001强调过程方法、风险思维、监视测量、形成文件的信息和持续改进。本方案据此把每次异常组织为包含风险、措施、验证、责任和回写的闭环。NIST AI RMF要求明确人机角色、监督机制、文档和审计，本方案据此设置P1人工确认、低置信降级、数据缺失停派和全链路审计。</w:t>
-      </w:r>
-    </w:p>
-    <w:p>
-      <w:r>
-        <w:t xml:space="preserve"/>
-      </w:r>
-    </w:p>
-    <w:p>
-      <w:pPr>
-        <w:pStyle w:val="BodyText"/>
-      </w:pPr>
-      <w:r>
-        <w:t xml:space="preserve">ISO 23247-2从制造域实体和功能实体两个视角规定数字孪生参考架构，为设备、过程、产品和应用分层建模提供依据。OPC UA for ISA-95为设备、物料、人员及企业/控制系统信息交换提供统一语义。本方案据此定义OT现场、边缘、事件、知识、Agent和协同层，并固定阻断数字员工到PLC的控制写入路径。</w:t>
-      </w:r>
-    </w:p>
-    <w:p>
-      <w:r>
-        <w:t xml:space="preserve"/>
-      </w:r>
-    </w:p>
-    <w:p>
-      <w:pPr>
-        <w:pStyle w:val="BodyText"/>
-      </w:pPr>
-      <w:r>
-        <w:t xml:space="preserve">NIST SP 800-82 Rev.3强调OT环境的可用性、安全性、网络分区、访问控制、监测与恢复。本方案据此设置OT控制区、边缘区、工业DMZ和IT应用区，只读采集、身份与序列号、数据质量隔离、模式权限、Outbox补偿和恢复演练。AIAG Control Plan与AIAG-VDA FMEA为过程功能、失效后果、失效模式、失效原因、预防/探测控制、行动优先级、反应计划和有效性验证提供汽车质量语义依据。</w:t>
+        <w:t xml:space="preserve">二、技术研究依据</w:t>
+      </w:r>
+    </w:p>
+    <w:p>
+      <w:r>
+        <w:t xml:space="preserve"/>
+      </w:r>
+    </w:p>
+    <w:p>
+      <w:pPr>
+        <w:pStyle w:val="BodyText"/>
+      </w:pPr>
+      <w:r>
+        <w:t xml:space="preserve">Wehner等针对电动车制造根因分析提出知识图谱、因果贝叶斯网络和专家反馈结合的方法，说明专家知识能缩小因果搜索空间并减少伪因果。Root-KGD将工业数据特征与设备、物流等实体结合，用知识图谱定位根因并提供物理实体解释。Fraunhofer研究进一步将异常检测、时间有效因果图和反事实干预组合，使候选根因具有可验证、可证伪路径。制造问题求解GraphRAG研究把在线异常检测、FMEA贝叶斯网络、历史8D图谱和混合检索串联，为本方案的“发现—推理—行动”提供技术依据。Document GraphRAG和ProQ-KG分别支撑制造文档结构检索及产品—过程—资源—FMEA统一建模。</w:t>
       </w:r>
     </w:p>
     <w:p>
@@ -339,20 +313,46 @@
         <w:keepNext/>
       </w:pPr>
       <w:r>
-        <w:t xml:space="preserve">四、飞书能力依据</w:t>
-      </w:r>
-    </w:p>
-    <w:p>
-      <w:r>
-        <w:t xml:space="preserve"/>
-      </w:r>
-    </w:p>
-    <w:p>
-      <w:pPr>
-        <w:pStyle w:val="BodyText"/>
-      </w:pPr>
-      <w:r>
-        <w:t xml:space="preserve">飞书开放平台多维表格支持表、字段、记录、视图、仪表盘、角色权限和自动化流程；任务v2支持负责人、关注人、子任务、评论、附件和幂等调用；消息卡片支持按钮、选择器和回传交互；文档OpenAPI支持创建和编辑结构化文档；任务与消息事件支持状态监听。由此形成“Base台账—卡片通知—任务执行—文档复盘—事件回写”的执行织网。</w:t>
+        <w:t xml:space="preserve">三、质量管理与可信AI依据</w:t>
+      </w:r>
+    </w:p>
+    <w:p>
+      <w:r>
+        <w:t xml:space="preserve"/>
+      </w:r>
+    </w:p>
+    <w:p>
+      <w:pPr>
+        <w:pStyle w:val="BodyText"/>
+      </w:pPr>
+      <w:r>
+        <w:t xml:space="preserve">ISO 9001强调过程方法、风险思维、监视测量、形成文件的信息和持续改进。本方案据此把每次异常组织为包含风险、措施、验证、责任和回写的闭环。NIST AI RMF要求明确人机角色、监督机制、文档和审计，本方案据此设置P1人工确认、低置信降级、数据缺失停派和全链路审计。</w:t>
+      </w:r>
+    </w:p>
+    <w:p>
+      <w:r>
+        <w:t xml:space="preserve"/>
+      </w:r>
+    </w:p>
+    <w:p>
+      <w:pPr>
+        <w:pStyle w:val="BodyText"/>
+      </w:pPr>
+      <w:r>
+        <w:t xml:space="preserve">ISO 23247-2从制造域实体和功能实体两个视角规定数字孪生参考架构，为设备、过程、产品和应用分层建模提供依据。OPC UA for ISA-95为设备、物料、人员及企业/控制系统信息交换提供统一语义。本方案据此定义OT现场、边缘、事件、知识、Agent和协同层，并固定阻断数字员工到PLC的控制写入路径。</w:t>
+      </w:r>
+    </w:p>
+    <w:p>
+      <w:r>
+        <w:t xml:space="preserve"/>
+      </w:r>
+    </w:p>
+    <w:p>
+      <w:pPr>
+        <w:pStyle w:val="BodyText"/>
+      </w:pPr>
+      <w:r>
+        <w:t xml:space="preserve">NIST SP 800-82 Rev.3强调OT环境的可用性、安全性、网络分区、访问控制、监测与恢复。本方案据此设置OT控制区、边缘区、工业DMZ和IT应用区，只读采集、身份与序列号、数据质量隔离、模式权限、Outbox补偿和恢复演练。AIAG Control Plan与AIAG-VDA FMEA为过程功能、失效后果、失效模式、失效原因、预防/探测控制、行动优先级、反应计划和有效性验证提供汽车质量语义依据。</w:t>
       </w:r>
     </w:p>
     <w:p>
@@ -366,6 +366,33 @@
         <w:keepNext/>
       </w:pPr>
       <w:r>
+        <w:t xml:space="preserve">四、飞书能力依据</w:t>
+      </w:r>
+    </w:p>
+    <w:p>
+      <w:r>
+        <w:t xml:space="preserve"/>
+      </w:r>
+    </w:p>
+    <w:p>
+      <w:pPr>
+        <w:pStyle w:val="BodyText"/>
+      </w:pPr>
+      <w:r>
+        <w:t xml:space="preserve">飞书开放平台多维表格支持表、字段、记录、视图、仪表盘、角色权限和自动化流程；任务v2支持负责人、关注人、子任务、评论、附件和幂等调用；消息卡片支持按钮、选择器和回传交互；文档OpenAPI支持创建和编辑结构化文档；任务与消息事件支持状态监听。由此形成“Base台账—卡片通知—任务执行—文档复盘—事件回写”的执行织网。</w:t>
+      </w:r>
+    </w:p>
+    <w:p>
+      <w:r>
+        <w:t xml:space="preserve"/>
+      </w:r>
+    </w:p>
+    <w:p>
+      <w:pPr>
+        <w:pStyle w:val="Heading1"/>
+        <w:keepNext/>
+      </w:pPr>
+      <w:r>
         <w:t xml:space="preserve">五、参考文献</w:t>
       </w:r>
     </w:p>
@@ -596,6 +623,14 @@
       </w:pPr>
       <w:r>
         <w:t xml:space="preserve">28. 赛力斯集团. 赛力斯设备场景闭环脱敏数据包[DB]. 赛事提供脱敏数据, 2026.</w:t>
+      </w:r>
+    </w:p>
+    <w:p>
+      <w:pPr>
+        <w:pStyle w:val="ReferenceList"/>
+      </w:pPr>
+      <w:r>
+        <w:t xml:space="preserve">29. McCann M, Johnston A. SECOM[DB/OL]. UCI Machine Learning Repository, 2008. DOI:10.24432/C54305. https://archive.ics.uci.edu/dataset/179/secom.</w:t>
       </w:r>
     </w:p>
     <w:p>

</xml_diff>